<commit_message>
Simplify lab 2 report layout
</commit_message>
<xml_diff>
--- a/Отчет_ЛР2_PTPM_VKI.docx
+++ b/Отчет_ЛР2_PTPM_VKI.docx
@@ -5,8 +5,8 @@
     <w:p>
       <w:pPr>
         <w:pStyle w:val="Title"/>
-        <w:spacing w:before="2000"/>
-        <w:jc w:val="center"/>
+        <w:spacing w:before="0"/>
+        <w:jc w:val="left"/>
       </w:pPr>
       <w:r>
         <w:t>Отчет по лабораторной работе 2</w:t>
@@ -14,50 +14,23 @@
     </w:p>
     <w:p>
       <w:pPr>
-        <w:spacing w:after="640"/>
-        <w:jc w:val="center"/>
+        <w:spacing w:after="200"/>
       </w:pPr>
       <w:r>
         <w:rPr>
           <w:rFonts w:ascii="Liberation Sans" w:hAnsi="Liberation Sans"/>
-          <w:color w:val="373737"/>
-          <w:sz w:val="28"/>
+          <w:i/>
+          <w:sz w:val="24"/>
         </w:rPr>
-        <w:t>Юнит тестирование проектов и автоматизация проверок</w:t>
+        <w:t>Юнит-тестирование проектов и автоматизация проверок</w:t>
       </w:r>
     </w:p>
     <w:p>
       <w:pPr>
-        <w:spacing w:before="800" w:line="360" w:lineRule="auto"/>
-        <w:jc w:val="center"/>
+        <w:spacing w:after="240"/>
       </w:pPr>
       <w:r>
-        <w:rPr>
-          <w:b/>
-        </w:rPr>
-        <w:t>Проект: PTPM-VKI</w:t>
-        <w:br/>
-      </w:r>
-      <w:r>
-        <w:t>Технологии: Python 3.x и unittest</w:t>
-        <w:br/>
-      </w:r>
-      <w:r>
-        <w:t>Дата выполнения: 7 октября 2026 года</w:t>
-      </w:r>
-    </w:p>
-    <w:p>
-      <w:pPr>
-        <w:spacing w:before="2200" w:after="0"/>
-        <w:jc w:val="center"/>
-      </w:pPr>
-      <w:r>
-        <w:t>Работа выполнена на основе задания из ветки Lab_2</w:t>
-      </w:r>
-    </w:p>
-    <w:p>
-      <w:r>
-        <w:br w:type="page"/>
+        <w:t>Проект: PTPM-VKI. Python 3.x, unittest. Дата: 7 октября 2026 года.</w:t>
       </w:r>
     </w:p>
     <w:p>
@@ -192,17 +165,18 @@
               <w:bottom w:w="90" w:type="dxa"/>
               <w:end w:w="100" w:type="dxa"/>
             </w:tcMar>
-            <w:shd w:fill="1F4E78"/>
+            <w:shd w:fill="E7E6E6"/>
           </w:tcPr>
           <w:p>
             <w:pPr>
+              <w:keepNext/>
               <w:spacing w:after="0" w:line="240" w:lineRule="auto"/>
             </w:pPr>
             <w:r>
               <w:rPr>
                 <w:rFonts w:ascii="Liberation Sans" w:hAnsi="Liberation Sans" w:eastAsia="Liberation Sans"/>
                 <w:b/>
-                <w:color w:val="FFFFFF"/>
+                <w:color w:val="000000"/>
                 <w:sz w:val="18"/>
               </w:rPr>
               <w:t>Модуль</w:t>
@@ -227,17 +201,18 @@
               <w:bottom w:w="90" w:type="dxa"/>
               <w:end w:w="100" w:type="dxa"/>
             </w:tcMar>
-            <w:shd w:fill="1F4E78"/>
+            <w:shd w:fill="E7E6E6"/>
           </w:tcPr>
           <w:p>
             <w:pPr>
+              <w:keepNext/>
               <w:spacing w:after="0" w:line="240" w:lineRule="auto"/>
             </w:pPr>
             <w:r>
               <w:rPr>
                 <w:rFonts w:ascii="Liberation Sans" w:hAnsi="Liberation Sans" w:eastAsia="Liberation Sans"/>
                 <w:b/>
-                <w:color w:val="FFFFFF"/>
+                <w:color w:val="000000"/>
                 <w:sz w:val="18"/>
               </w:rPr>
               <w:t>Всего тестов</w:t>
@@ -262,17 +237,18 @@
               <w:bottom w:w="90" w:type="dxa"/>
               <w:end w:w="100" w:type="dxa"/>
             </w:tcMar>
-            <w:shd w:fill="1F4E78"/>
+            <w:shd w:fill="E7E6E6"/>
           </w:tcPr>
           <w:p>
             <w:pPr>
+              <w:keepNext/>
               <w:spacing w:after="0" w:line="240" w:lineRule="auto"/>
             </w:pPr>
             <w:r>
               <w:rPr>
                 <w:rFonts w:ascii="Liberation Sans" w:hAnsi="Liberation Sans" w:eastAsia="Liberation Sans"/>
                 <w:b/>
-                <w:color w:val="FFFFFF"/>
+                <w:color w:val="000000"/>
                 <w:sz w:val="18"/>
               </w:rPr>
               <w:t>Пройдено</w:t>
@@ -297,17 +273,18 @@
               <w:bottom w:w="90" w:type="dxa"/>
               <w:end w:w="100" w:type="dxa"/>
             </w:tcMar>
-            <w:shd w:fill="1F4E78"/>
+            <w:shd w:fill="E7E6E6"/>
           </w:tcPr>
           <w:p>
             <w:pPr>
+              <w:keepNext/>
               <w:spacing w:after="0" w:line="240" w:lineRule="auto"/>
             </w:pPr>
             <w:r>
               <w:rPr>
                 <w:rFonts w:ascii="Liberation Sans" w:hAnsi="Liberation Sans" w:eastAsia="Liberation Sans"/>
                 <w:b/>
-                <w:color w:val="FFFFFF"/>
+                <w:color w:val="000000"/>
                 <w:sz w:val="18"/>
               </w:rPr>
               <w:t>Упало</w:t>
@@ -332,17 +309,18 @@
               <w:bottom w:w="90" w:type="dxa"/>
               <w:end w:w="100" w:type="dxa"/>
             </w:tcMar>
-            <w:shd w:fill="1F4E78"/>
+            <w:shd w:fill="E7E6E6"/>
           </w:tcPr>
           <w:p>
             <w:pPr>
+              <w:keepNext/>
               <w:spacing w:after="0" w:line="240" w:lineRule="auto"/>
             </w:pPr>
             <w:r>
               <w:rPr>
                 <w:rFonts w:ascii="Liberation Sans" w:hAnsi="Liberation Sans" w:eastAsia="Liberation Sans"/>
                 <w:b/>
-                <w:color w:val="FFFFFF"/>
+                <w:color w:val="000000"/>
                 <w:sz w:val="18"/>
               </w:rPr>
               <w:t>Итог</w:t>
@@ -536,7 +514,7 @@
               <w:bottom w:w="90" w:type="dxa"/>
               <w:end w:w="100" w:type="dxa"/>
             </w:tcMar>
-            <w:shd w:fill="F3F8FC"/>
+            <w:shd w:fill="F7F7F7"/>
           </w:tcPr>
           <w:p>
             <w:pPr>
@@ -570,7 +548,7 @@
               <w:bottom w:w="90" w:type="dxa"/>
               <w:end w:w="100" w:type="dxa"/>
             </w:tcMar>
-            <w:shd w:fill="F3F8FC"/>
+            <w:shd w:fill="F7F7F7"/>
           </w:tcPr>
           <w:p>
             <w:pPr>
@@ -604,7 +582,7 @@
               <w:bottom w:w="90" w:type="dxa"/>
               <w:end w:w="100" w:type="dxa"/>
             </w:tcMar>
-            <w:shd w:fill="F3F8FC"/>
+            <w:shd w:fill="F7F7F7"/>
           </w:tcPr>
           <w:p>
             <w:pPr>
@@ -638,7 +616,7 @@
               <w:bottom w:w="90" w:type="dxa"/>
               <w:end w:w="100" w:type="dxa"/>
             </w:tcMar>
-            <w:shd w:fill="F3F8FC"/>
+            <w:shd w:fill="F7F7F7"/>
           </w:tcPr>
           <w:p>
             <w:pPr>
@@ -672,7 +650,7 @@
               <w:bottom w:w="90" w:type="dxa"/>
               <w:end w:w="100" w:type="dxa"/>
             </w:tcMar>
-            <w:shd w:fill="F3F8FC"/>
+            <w:shd w:fill="F7F7F7"/>
           </w:tcPr>
           <w:p>
             <w:pPr>
@@ -921,17 +899,18 @@
               <w:bottom w:w="90" w:type="dxa"/>
               <w:end w:w="100" w:type="dxa"/>
             </w:tcMar>
-            <w:shd w:fill="1F4E78"/>
+            <w:shd w:fill="E7E6E6"/>
           </w:tcPr>
           <w:p>
             <w:pPr>
+              <w:keepNext/>
               <w:spacing w:after="0" w:line="240" w:lineRule="auto"/>
             </w:pPr>
             <w:r>
               <w:rPr>
                 <w:rFonts w:ascii="Liberation Sans" w:hAnsi="Liberation Sans" w:eastAsia="Liberation Sans"/>
                 <w:b/>
-                <w:color w:val="FFFFFF"/>
+                <w:color w:val="000000"/>
                 <w:sz w:val="16"/>
               </w:rPr>
               <w:t>Упавший тест</w:t>
@@ -956,17 +935,18 @@
               <w:bottom w:w="90" w:type="dxa"/>
               <w:end w:w="100" w:type="dxa"/>
             </w:tcMar>
-            <w:shd w:fill="1F4E78"/>
+            <w:shd w:fill="E7E6E6"/>
           </w:tcPr>
           <w:p>
             <w:pPr>
+              <w:keepNext/>
               <w:spacing w:after="0" w:line="240" w:lineRule="auto"/>
             </w:pPr>
             <w:r>
               <w:rPr>
                 <w:rFonts w:ascii="Liberation Sans" w:hAnsi="Liberation Sans" w:eastAsia="Liberation Sans"/>
                 <w:b/>
-                <w:color w:val="FFFFFF"/>
+                <w:color w:val="000000"/>
                 <w:sz w:val="16"/>
               </w:rPr>
               <w:t>Строка</w:t>
@@ -991,17 +971,18 @@
               <w:bottom w:w="90" w:type="dxa"/>
               <w:end w:w="100" w:type="dxa"/>
             </w:tcMar>
-            <w:shd w:fill="1F4E78"/>
+            <w:shd w:fill="E7E6E6"/>
           </w:tcPr>
           <w:p>
             <w:pPr>
+              <w:keepNext/>
               <w:spacing w:after="0" w:line="240" w:lineRule="auto"/>
             </w:pPr>
             <w:r>
               <w:rPr>
                 <w:rFonts w:ascii="Liberation Sans" w:hAnsi="Liberation Sans" w:eastAsia="Liberation Sans"/>
                 <w:b/>
-                <w:color w:val="FFFFFF"/>
+                <w:color w:val="000000"/>
                 <w:sz w:val="16"/>
               </w:rPr>
               <w:t>Дефект</w:t>
@@ -1026,17 +1007,18 @@
               <w:bottom w:w="90" w:type="dxa"/>
               <w:end w:w="100" w:type="dxa"/>
             </w:tcMar>
-            <w:shd w:fill="1F4E78"/>
+            <w:shd w:fill="E7E6E6"/>
           </w:tcPr>
           <w:p>
             <w:pPr>
+              <w:keepNext/>
               <w:spacing w:after="0" w:line="240" w:lineRule="auto"/>
             </w:pPr>
             <w:r>
               <w:rPr>
                 <w:rFonts w:ascii="Liberation Sans" w:hAnsi="Liberation Sans" w:eastAsia="Liberation Sans"/>
                 <w:b/>
-                <w:color w:val="FFFFFF"/>
+                <w:color w:val="000000"/>
                 <w:sz w:val="16"/>
               </w:rPr>
               <w:t>Вариант исправления</w:t>
@@ -1197,7 +1179,7 @@
               <w:bottom w:w="90" w:type="dxa"/>
               <w:end w:w="100" w:type="dxa"/>
             </w:tcMar>
-            <w:shd w:fill="F3F8FC"/>
+            <w:shd w:fill="F7F7F7"/>
           </w:tcPr>
           <w:p>
             <w:pPr>
@@ -1231,7 +1213,7 @@
               <w:bottom w:w="90" w:type="dxa"/>
               <w:end w:w="100" w:type="dxa"/>
             </w:tcMar>
-            <w:shd w:fill="F3F8FC"/>
+            <w:shd w:fill="F7F7F7"/>
           </w:tcPr>
           <w:p>
             <w:pPr>
@@ -1265,7 +1247,7 @@
               <w:bottom w:w="90" w:type="dxa"/>
               <w:end w:w="100" w:type="dxa"/>
             </w:tcMar>
-            <w:shd w:fill="F3F8FC"/>
+            <w:shd w:fill="F7F7F7"/>
           </w:tcPr>
           <w:p>
             <w:pPr>
@@ -1299,7 +1281,7 @@
               <w:bottom w:w="90" w:type="dxa"/>
               <w:end w:w="100" w:type="dxa"/>
             </w:tcMar>
-            <w:shd w:fill="F3F8FC"/>
+            <w:shd w:fill="F7F7F7"/>
           </w:tcPr>
           <w:p>
             <w:pPr>
@@ -1469,7 +1451,7 @@
               <w:bottom w:w="90" w:type="dxa"/>
               <w:end w:w="100" w:type="dxa"/>
             </w:tcMar>
-            <w:shd w:fill="F3F8FC"/>
+            <w:shd w:fill="F7F7F7"/>
           </w:tcPr>
           <w:p>
             <w:pPr>
@@ -1503,7 +1485,7 @@
               <w:bottom w:w="90" w:type="dxa"/>
               <w:end w:w="100" w:type="dxa"/>
             </w:tcMar>
-            <w:shd w:fill="F3F8FC"/>
+            <w:shd w:fill="F7F7F7"/>
           </w:tcPr>
           <w:p>
             <w:pPr>
@@ -1537,7 +1519,7 @@
               <w:bottom w:w="90" w:type="dxa"/>
               <w:end w:w="100" w:type="dxa"/>
             </w:tcMar>
-            <w:shd w:fill="F3F8FC"/>
+            <w:shd w:fill="F7F7F7"/>
           </w:tcPr>
           <w:p>
             <w:pPr>
@@ -1571,7 +1553,7 @@
               <w:bottom w:w="90" w:type="dxa"/>
               <w:end w:w="100" w:type="dxa"/>
             </w:tcMar>
-            <w:shd w:fill="F3F8FC"/>
+            <w:shd w:fill="F7F7F7"/>
           </w:tcPr>
           <w:p>
             <w:pPr>

</xml_diff>

<commit_message>
Fix delivery module and update report
</commit_message>
<xml_diff>
--- a/Отчет_ЛР2_PTPM_VKI.docx
+++ b/Отчет_ЛР2_PTPM_VKI.docx
@@ -126,7 +126,7 @@
         <w:ind w:firstLine="360"/>
       </w:pPr>
       <w:r>
-        <w:t>После исправления собственного валидатора все его тесты проходят. Тесты учебного модуля доставки намеренно сохранены в виде проверок бизнес-контракта: четыре теста падают на исходной реализации и тем самым локализуют несоответствия, которые необходимо исправить в delivery.py.</w:t>
+        <w:t>Сначала тесты были запущены на исходном delivery.py из задания. Они нашли четыре ошибки. После простых исправлений в validator.py и delivery.py повторный запуск показал успешное прохождение всех 40 тестов.</w:t>
       </w:r>
     </w:p>
     <w:tbl>
@@ -526,7 +526,7 @@
                 <w:color w:val="000000"/>
                 <w:sz w:val="18"/>
               </w:rPr>
-              <w:t>delivery.py</w:t>
+              <w:t>delivery.py до исправления</w:t>
             </w:r>
           </w:p>
         </w:tc>
@@ -662,7 +662,7 @@
                 <w:color w:val="000000"/>
                 <w:sz w:val="18"/>
               </w:rPr>
-              <w:t>Есть несоответствия</w:t>
+              <w:t>Найдены ошибки</w:t>
             </w:r>
           </w:p>
         </w:tc>
@@ -697,7 +697,7 @@
                 <w:color w:val="000000"/>
                 <w:sz w:val="18"/>
               </w:rPr>
-              <w:t>Итого</w:t>
+              <w:t>delivery.py после исправления</w:t>
             </w:r>
           </w:p>
         </w:tc>
@@ -719,6 +719,175 @@
               <w:bottom w:w="90" w:type="dxa"/>
               <w:end w:w="100" w:type="dxa"/>
             </w:tcMar>
+          </w:tcPr>
+          <w:p>
+            <w:pPr>
+              <w:spacing w:after="0" w:line="240" w:lineRule="auto"/>
+            </w:pPr>
+            <w:r>
+              <w:rPr>
+                <w:rFonts w:ascii="Liberation Sans" w:hAnsi="Liberation Sans" w:eastAsia="Liberation Sans"/>
+                <w:color w:val="000000"/>
+                <w:sz w:val="18"/>
+              </w:rPr>
+              <w:t>19</w:t>
+            </w:r>
+          </w:p>
+        </w:tc>
+        <w:tc>
+          <w:tcPr>
+            <w:tcW w:type="dxa" w:w="1224"/>
+            <w:vAlign w:val="center"/>
+            <w:tcBorders>
+              <w:top w:val="single" w:sz="6" w:space="0" w:color="B7C9D6"/>
+              <w:left w:val="single" w:sz="6" w:space="0" w:color="B7C9D6"/>
+              <w:bottom w:val="single" w:sz="6" w:space="0" w:color="B7C9D6"/>
+              <w:right w:val="single" w:sz="6" w:space="0" w:color="B7C9D6"/>
+              <w:insideH w:val="single" w:sz="6" w:space="0" w:color="B7C9D6"/>
+              <w:insideV w:val="single" w:sz="6" w:space="0" w:color="B7C9D6"/>
+            </w:tcBorders>
+            <w:tcMar>
+              <w:top w:w="90" w:type="dxa"/>
+              <w:start w:w="100" w:type="dxa"/>
+              <w:bottom w:w="90" w:type="dxa"/>
+              <w:end w:w="100" w:type="dxa"/>
+            </w:tcMar>
+          </w:tcPr>
+          <w:p>
+            <w:pPr>
+              <w:spacing w:after="0" w:line="240" w:lineRule="auto"/>
+            </w:pPr>
+            <w:r>
+              <w:rPr>
+                <w:rFonts w:ascii="Liberation Sans" w:hAnsi="Liberation Sans" w:eastAsia="Liberation Sans"/>
+                <w:color w:val="000000"/>
+                <w:sz w:val="18"/>
+              </w:rPr>
+              <w:t>19</w:t>
+            </w:r>
+          </w:p>
+        </w:tc>
+        <w:tc>
+          <w:tcPr>
+            <w:tcW w:type="dxa" w:w="1007"/>
+            <w:vAlign w:val="center"/>
+            <w:tcBorders>
+              <w:top w:val="single" w:sz="6" w:space="0" w:color="B7C9D6"/>
+              <w:left w:val="single" w:sz="6" w:space="0" w:color="B7C9D6"/>
+              <w:bottom w:val="single" w:sz="6" w:space="0" w:color="B7C9D6"/>
+              <w:right w:val="single" w:sz="6" w:space="0" w:color="B7C9D6"/>
+              <w:insideH w:val="single" w:sz="6" w:space="0" w:color="B7C9D6"/>
+              <w:insideV w:val="single" w:sz="6" w:space="0" w:color="B7C9D6"/>
+            </w:tcBorders>
+            <w:tcMar>
+              <w:top w:w="90" w:type="dxa"/>
+              <w:start w:w="100" w:type="dxa"/>
+              <w:bottom w:w="90" w:type="dxa"/>
+              <w:end w:w="100" w:type="dxa"/>
+            </w:tcMar>
+          </w:tcPr>
+          <w:p>
+            <w:pPr>
+              <w:spacing w:after="0" w:line="240" w:lineRule="auto"/>
+            </w:pPr>
+            <w:r>
+              <w:rPr>
+                <w:rFonts w:ascii="Liberation Sans" w:hAnsi="Liberation Sans" w:eastAsia="Liberation Sans"/>
+                <w:color w:val="000000"/>
+                <w:sz w:val="18"/>
+              </w:rPr>
+              <w:t>0</w:t>
+            </w:r>
+          </w:p>
+        </w:tc>
+        <w:tc>
+          <w:tcPr>
+            <w:tcW w:type="dxa" w:w="2880"/>
+            <w:vAlign w:val="center"/>
+            <w:tcBorders>
+              <w:top w:val="single" w:sz="6" w:space="0" w:color="B7C9D6"/>
+              <w:left w:val="single" w:sz="6" w:space="0" w:color="B7C9D6"/>
+              <w:bottom w:val="single" w:sz="6" w:space="0" w:color="B7C9D6"/>
+              <w:right w:val="single" w:sz="6" w:space="0" w:color="B7C9D6"/>
+              <w:insideH w:val="single" w:sz="6" w:space="0" w:color="B7C9D6"/>
+              <w:insideV w:val="single" w:sz="6" w:space="0" w:color="B7C9D6"/>
+            </w:tcBorders>
+            <w:tcMar>
+              <w:top w:w="90" w:type="dxa"/>
+              <w:start w:w="100" w:type="dxa"/>
+              <w:bottom w:w="90" w:type="dxa"/>
+              <w:end w:w="100" w:type="dxa"/>
+            </w:tcMar>
+          </w:tcPr>
+          <w:p>
+            <w:pPr>
+              <w:spacing w:after="0" w:line="240" w:lineRule="auto"/>
+            </w:pPr>
+            <w:r>
+              <w:rPr>
+                <w:rFonts w:ascii="Liberation Sans" w:hAnsi="Liberation Sans" w:eastAsia="Liberation Sans"/>
+                <w:color w:val="000000"/>
+                <w:sz w:val="18"/>
+              </w:rPr>
+              <w:t>Успешно</w:t>
+            </w:r>
+          </w:p>
+        </w:tc>
+      </w:tr>
+      <w:tr>
+        <w:tc>
+          <w:tcPr>
+            <w:tcW w:type="dxa" w:w="3096"/>
+            <w:vAlign w:val="center"/>
+            <w:tcBorders>
+              <w:top w:val="single" w:sz="6" w:space="0" w:color="B7C9D6"/>
+              <w:left w:val="single" w:sz="6" w:space="0" w:color="B7C9D6"/>
+              <w:bottom w:val="single" w:sz="6" w:space="0" w:color="B7C9D6"/>
+              <w:right w:val="single" w:sz="6" w:space="0" w:color="B7C9D6"/>
+              <w:insideH w:val="single" w:sz="6" w:space="0" w:color="B7C9D6"/>
+              <w:insideV w:val="single" w:sz="6" w:space="0" w:color="B7C9D6"/>
+            </w:tcBorders>
+            <w:tcMar>
+              <w:top w:w="90" w:type="dxa"/>
+              <w:start w:w="100" w:type="dxa"/>
+              <w:bottom w:w="90" w:type="dxa"/>
+              <w:end w:w="100" w:type="dxa"/>
+            </w:tcMar>
+            <w:shd w:fill="F7F7F7"/>
+          </w:tcPr>
+          <w:p>
+            <w:pPr>
+              <w:spacing w:after="0" w:line="240" w:lineRule="auto"/>
+            </w:pPr>
+            <w:r>
+              <w:rPr>
+                <w:rFonts w:ascii="Liberation Sans" w:hAnsi="Liberation Sans" w:eastAsia="Liberation Sans"/>
+                <w:color w:val="000000"/>
+                <w:sz w:val="18"/>
+              </w:rPr>
+              <w:t>Итого после исправления</w:t>
+            </w:r>
+          </w:p>
+        </w:tc>
+        <w:tc>
+          <w:tcPr>
+            <w:tcW w:type="dxa" w:w="1296"/>
+            <w:vAlign w:val="center"/>
+            <w:tcBorders>
+              <w:top w:val="single" w:sz="6" w:space="0" w:color="B7C9D6"/>
+              <w:left w:val="single" w:sz="6" w:space="0" w:color="B7C9D6"/>
+              <w:bottom w:val="single" w:sz="6" w:space="0" w:color="B7C9D6"/>
+              <w:right w:val="single" w:sz="6" w:space="0" w:color="B7C9D6"/>
+              <w:insideH w:val="single" w:sz="6" w:space="0" w:color="B7C9D6"/>
+              <w:insideV w:val="single" w:sz="6" w:space="0" w:color="B7C9D6"/>
+            </w:tcBorders>
+            <w:tcMar>
+              <w:top w:w="90" w:type="dxa"/>
+              <w:start w:w="100" w:type="dxa"/>
+              <w:bottom w:w="90" w:type="dxa"/>
+              <w:end w:w="100" w:type="dxa"/>
+            </w:tcMar>
+            <w:shd w:fill="F7F7F7"/>
           </w:tcPr>
           <w:p>
             <w:pPr>
@@ -752,6 +921,7 @@
               <w:bottom w:w="90" w:type="dxa"/>
               <w:end w:w="100" w:type="dxa"/>
             </w:tcMar>
+            <w:shd w:fill="F7F7F7"/>
           </w:tcPr>
           <w:p>
             <w:pPr>
@@ -763,7 +933,7 @@
                 <w:color w:val="000000"/>
                 <w:sz w:val="18"/>
               </w:rPr>
-              <w:t>36</w:t>
+              <w:t>40</w:t>
             </w:r>
           </w:p>
         </w:tc>
@@ -785,6 +955,7 @@
               <w:bottom w:w="90" w:type="dxa"/>
               <w:end w:w="100" w:type="dxa"/>
             </w:tcMar>
+            <w:shd w:fill="F7F7F7"/>
           </w:tcPr>
           <w:p>
             <w:pPr>
@@ -796,7 +967,7 @@
                 <w:color w:val="000000"/>
                 <w:sz w:val="18"/>
               </w:rPr>
-              <w:t>4</w:t>
+              <w:t>0</w:t>
             </w:r>
           </w:p>
         </w:tc>
@@ -818,6 +989,7 @@
               <w:bottom w:w="90" w:type="dxa"/>
               <w:end w:w="100" w:type="dxa"/>
             </w:tcMar>
+            <w:shd w:fill="F7F7F7"/>
           </w:tcPr>
           <w:p>
             <w:pPr>
@@ -829,7 +1001,7 @@
                 <w:color w:val="000000"/>
                 <w:sz w:val="18"/>
               </w:rPr>
-              <w:t>36 успешно, 4 требуют исправления</w:t>
+              <w:t>Все тесты пройдены</w:t>
             </w:r>
           </w:p>
         </w:tc>
@@ -845,7 +1017,7 @@
         <w:ind w:firstLine="360"/>
       </w:pPr>
       <w:r>
-        <w:t>Таким образом, пункт А задания выполнен: отдельно указаны количество тестов и статистика по каждому проекту. Пункт Б также выполнен: для delivery.py зафиксировано ровно 4 непрошедших теста.</w:t>
+        <w:t>Таким образом, пункт А задания выполнен: отдельно указаны количество тестов и статистика по каждому проекту. Пункт Б также выполнен: на исходном delivery.py зафиксировано ровно 4 непрошедших теста.</w:t>
       </w:r>
     </w:p>
     <w:p>
@@ -853,7 +1025,7 @@
         <w:pStyle w:val="Heading1"/>
       </w:pPr>
       <w:r>
-        <w:t>4 Локализация аномалий в delivery.py</w:t>
+        <w:t>4 Найденные дефекты и исправления</w:t>
       </w:r>
     </w:p>
     <w:p>
@@ -861,7 +1033,7 @@
         <w:ind w:firstLine="360"/>
       </w:pPr>
       <w:r>
-        <w:t>Ниже перечислены все четыре теста, которые не проходят на исходном коде. Номера строк относятся к файлу delivery.py, включенному в проект.</w:t>
+        <w:t>Ниже перечислены четыре теста, которые не проходили на исходном коде. Номера строк относятся к исходной версии delivery.py из задания; после анализа эти места были исправлены.</w:t>
       </w:r>
     </w:p>
     <w:tbl>
@@ -1581,7 +1753,7 @@
         <w:pStyle w:val="Heading1"/>
       </w:pPr>
       <w:r>
-        <w:t>5 Исправления в модуле регистрации</w:t>
+        <w:t>5 Выполненные исправления</w:t>
       </w:r>
     </w:p>
     <w:p>
@@ -1590,6 +1762,14 @@
       </w:pPr>
       <w:r>
         <w:t>В validator.py исправлены два дефекта, обнаруженные тестами лабораторной работы 1. Во-первых, в множестве blacklist добавлены пропущенные запятые, поэтому пять запрещенных логинов теперь хранятся как отдельные элементы и проверяются без учета регистра. Во-вторых, проверка каждого символа пароля отделена от проверок обязательных категорий и сравнения подтверждения пароля. Благодаря этому весь пароль проверяется до успешного завершения функции, а недопустимый символ после корректного префикса больше не пропускается.</w:t>
+      </w:r>
+    </w:p>
+    <w:p>
+      <w:pPr>
+        <w:ind w:firstLine="360"/>
+      </w:pPr>
+      <w:r>
+        <w:t>В delivery.py добавлена простая проверка типов входных данных до сравнения границ. Для экспресс-доставки установлен минимальный срок в один день: после деления days_needed на два применяется max(1, days_needed // 2).</w:t>
       </w:r>
     </w:p>
     <w:p>
@@ -1605,7 +1785,7 @@
         <w:ind w:firstLine="360"/>
       </w:pPr>
       <w:r>
-        <w:t>В работе подготовлен набор из 40 независимых юнит-тестов. Валидатор регистрации проверен полностью: 21 из 21 теста проходят. Для модуля доставки реализовано 19 тестов, из которых 15 проходят, а 4 воспроизводят конкретные дефекты исходной реализации. Для каждого дефекта указаны тест, строка, причина несоответствия и точечный вариант исправления. Проект готов к запуску через unittest и к демонстрации результатов мастеру практики.</w:t>
+        <w:t>В работе подготовлен набор из 40 независимых юнит-тестов. После исправления валидатора регистрации и модуля доставки все 40 тестов проходят. Четыре исходных дефекта delivery.py зафиксированы в отчете вместе с тестами, строками кода и вариантами исправления. Проект готов к запуску через unittest и к демонстрации результатов мастеру практики.</w:t>
       </w:r>
     </w:p>
     <w:sectPr>

</xml_diff>